<commit_message>
fixed the certs templates
</commit_message>
<xml_diff>
--- a/certificates/medical_certs_template/Medical Certificate-Absences  of classes-work.docx
+++ b/certificates/medical_certs_template/Medical Certificate-Absences  of classes-work.docx
@@ -141,7 +141,25 @@
           <w:sz w:val="26"/>
           <w:szCs w:val="26"/>
         </w:rPr>
-        <w:t xml:space="preserve"> }} years old and a {% if year_level </w:t>
+        <w:t xml:space="preserve"> }} years old and a {% if </w:t>
+      </w:r>
+      <w:proofErr w:type="spellStart"/>
+      <w:r>
+        <w:rPr>
+          <w:rFonts w:ascii="Times New Roman" w:eastAsia="Times New Roman" w:hAnsi="Times New Roman" w:cs="Times New Roman"/>
+          <w:sz w:val="26"/>
+          <w:szCs w:val="26"/>
+        </w:rPr>
+        <w:t>year_level</w:t>
+      </w:r>
+      <w:proofErr w:type="spellEnd"/>
+      <w:r>
+        <w:rPr>
+          <w:rFonts w:ascii="Times New Roman" w:eastAsia="Times New Roman" w:hAnsi="Times New Roman" w:cs="Times New Roman"/>
+          <w:sz w:val="26"/>
+          <w:szCs w:val="26"/>
+        </w:rPr>
+        <w:t xml:space="preserve"> </w:t>
       </w:r>
       <w:proofErr w:type="gramStart"/>
       <w:r>
@@ -195,7 +213,15 @@
           <w:sz w:val="26"/>
           <w:szCs w:val="26"/>
         </w:rPr>
-        <w:t xml:space="preserve">% if college </w:t>
+        <w:t xml:space="preserve">% if </w:t>
+      </w:r>
+      <w:r>
+        <w:rPr>
+          <w:rFonts w:ascii="Times New Roman" w:eastAsia="Times New Roman" w:hAnsi="Times New Roman" w:cs="Times New Roman"/>
+          <w:sz w:val="26"/>
+          <w:szCs w:val="26"/>
+        </w:rPr>
+        <w:t>course</w:t>
       </w:r>
       <w:proofErr w:type="gramStart"/>
       <w:r>
@@ -204,7 +230,15 @@
           <w:sz w:val="26"/>
           <w:szCs w:val="26"/>
         </w:rPr>
-        <w:t>%}{{ college</w:t>
+        <w:t xml:space="preserve">%}{{ </w:t>
+      </w:r>
+      <w:r>
+        <w:rPr>
+          <w:rFonts w:ascii="Times New Roman" w:eastAsia="Times New Roman" w:hAnsi="Times New Roman" w:cs="Times New Roman"/>
+          <w:sz w:val="26"/>
+          <w:szCs w:val="26"/>
+        </w:rPr>
+        <w:t>course</w:t>
       </w:r>
       <w:proofErr w:type="gramEnd"/>
       <w:r>
@@ -213,25 +247,23 @@
           <w:sz w:val="26"/>
           <w:szCs w:val="26"/>
         </w:rPr>
-        <w:t xml:space="preserve"> }} {% endif </w:t>
+        <w:t>}} {% endif %}</w:t>
       </w:r>
-      <w:proofErr w:type="gramStart"/>
       <w:r>
         <w:rPr>
           <w:rFonts w:ascii="Times New Roman" w:eastAsia="Times New Roman" w:hAnsi="Times New Roman" w:cs="Times New Roman"/>
           <w:sz w:val="26"/>
           <w:szCs w:val="26"/>
         </w:rPr>
-        <w:t>%}student</w:t>
+        <w:t xml:space="preserve"> </w:t>
       </w:r>
-      <w:proofErr w:type="gramEnd"/>
       <w:r>
         <w:rPr>
           <w:rFonts w:ascii="Times New Roman" w:eastAsia="Times New Roman" w:hAnsi="Times New Roman" w:cs="Times New Roman"/>
           <w:sz w:val="26"/>
           <w:szCs w:val="26"/>
         </w:rPr>
-        <w:t xml:space="preserve"> in this campus, has been consulted in the clinic, due to the following complaints and assessments.</w:t>
+        <w:t>student in this campus, has been consulted in the clinic, due to the following complaints and assessments.</w:t>
       </w:r>
     </w:p>
     <w:p>
@@ -491,7 +523,25 @@
           <w:sz w:val="26"/>
           <w:szCs w:val="26"/>
         </w:rPr>
-        <w:t xml:space="preserve"> }} at Negros Oriental State University, Bayawan-Sta. Catalina Campus, Bayawan City, Philippines, for whatever legal purpose this may serve.</w:t>
+        <w:t xml:space="preserve"> }} at </w:t>
+      </w:r>
+      <w:proofErr w:type="gramStart"/>
+      <w:r>
+        <w:rPr>
+          <w:rFonts w:ascii="Times New Roman" w:hAnsi="Times New Roman" w:cs="Times New Roman"/>
+          <w:sz w:val="26"/>
+          <w:szCs w:val="26"/>
+        </w:rPr>
+        <w:t>{{ place</w:t>
+      </w:r>
+      <w:proofErr w:type="gramEnd"/>
+      <w:r>
+        <w:rPr>
+          <w:rFonts w:ascii="Times New Roman" w:hAnsi="Times New Roman" w:cs="Times New Roman"/>
+          <w:sz w:val="26"/>
+          <w:szCs w:val="26"/>
+        </w:rPr>
+        <w:t xml:space="preserve"> }}, for whatever legal purpose this may serve.</w:t>
       </w:r>
     </w:p>
     <w:p>
@@ -1922,7 +1972,7 @@
   </w:p>
   <w:tbl>
     <w:tblPr>
-      <w:tblStyle w:val="a6"/>
+      <w:tblStyle w:val="1"/>
       <w:tblW w:w="8730" w:type="dxa"/>
       <w:tblInd w:w="445" w:type="dxa"/>
       <w:tblBorders>
@@ -2917,7 +2967,7 @@
               <wp:extent cx="855980" cy="8507186"/>
               <wp:effectExtent l="0" t="0" r="20320" b="27305"/>
               <wp:wrapNone/>
-              <wp:docPr id="1336715347" name="Graphic 5"/>
+              <wp:docPr id="326742289" name="Graphic 5"/>
               <wp:cNvGraphicFramePr/>
               <a:graphic xmlns:a="http://schemas.openxmlformats.org/drawingml/2006/main">
                 <a:graphicData uri="http://schemas.microsoft.com/office/word/2010/wordprocessingShape">
@@ -2979,7 +3029,7 @@
         </mc:Choice>
         <mc:Fallback>
           <w:pict>
-            <v:shape w14:anchorId="1A0033D9" id="Graphic 5" o:spid="_x0000_s1026" style="position:absolute;margin-left:-74.75pt;margin-top:14.55pt;width:67.4pt;height:669.85pt;z-index:251654143;visibility:visible;mso-wrap-style:square;mso-height-percent:0;mso-wrap-distance-left:9pt;mso-wrap-distance-top:0;mso-wrap-distance-right:9pt;mso-wrap-distance-bottom:0;mso-position-horizontal:absolute;mso-position-horizontal-relative:text;mso-position-vertical:absolute;mso-position-vertical-relative:text;mso-height-percent:0;mso-height-relative:margin;v-text-anchor:top" coordsize="855980,8851900" o:gfxdata="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" path="m,l855413,r,8851766l,8851766,,xe" filled="f" strokeweight=".5pt">
+            <v:shape w14:anchorId="63827272" id="Graphic 5" o:spid="_x0000_s1026" style="position:absolute;margin-left:-74.75pt;margin-top:14.55pt;width:67.4pt;height:669.85pt;z-index:251654143;visibility:visible;mso-wrap-style:square;mso-height-percent:0;mso-wrap-distance-left:9pt;mso-wrap-distance-top:0;mso-wrap-distance-right:9pt;mso-wrap-distance-bottom:0;mso-position-horizontal:absolute;mso-position-horizontal-relative:text;mso-position-vertical:absolute;mso-position-vertical-relative:text;mso-height-percent:0;mso-height-relative:margin;v-text-anchor:top" coordsize="855980,8851900" o:gfxdata="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" path="m,l855413,r,8851766l,8851766,,xe" filled="f" strokeweight=".5pt">
               <v:path arrowok="t"/>
             </v:shape>
           </w:pict>
@@ -3010,7 +3060,7 @@
               <wp:extent cx="855980" cy="8501743"/>
               <wp:effectExtent l="0" t="0" r="1270" b="0"/>
               <wp:wrapNone/>
-              <wp:docPr id="866158482" name="Graphic 4"/>
+              <wp:docPr id="1481706178" name="Graphic 4"/>
               <wp:cNvGraphicFramePr/>
               <a:graphic xmlns:a="http://schemas.openxmlformats.org/drawingml/2006/main">
                 <a:graphicData uri="http://schemas.microsoft.com/office/word/2010/wordprocessingShape">
@@ -3069,7 +3119,7 @@
         </mc:Choice>
         <mc:Fallback>
           <w:pict>
-            <v:shape w14:anchorId="67A7EA05" id="Graphic 4" o:spid="_x0000_s1026" style="position:absolute;margin-left:-74.75pt;margin-top:14.55pt;width:67.4pt;height:669.45pt;z-index:251653119;visibility:visible;mso-wrap-style:square;mso-height-percent:0;mso-wrap-distance-left:9pt;mso-wrap-distance-top:0;mso-wrap-distance-right:9pt;mso-wrap-distance-bottom:0;mso-position-horizontal:absolute;mso-position-horizontal-relative:text;mso-position-vertical:absolute;mso-position-vertical-relative:text;mso-height-percent:0;mso-height-relative:margin;v-text-anchor:top" coordsize="855980,8852535" o:gfxdata="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" path="m855453,8851937l,8851937,,,855453,r,8851937xe" stroked="f">
+            <v:shape w14:anchorId="45B143C4" id="Graphic 4" o:spid="_x0000_s1026" style="position:absolute;margin-left:-74.75pt;margin-top:14.55pt;width:67.4pt;height:669.45pt;z-index:251653119;visibility:visible;mso-wrap-style:square;mso-height-percent:0;mso-wrap-distance-left:9pt;mso-wrap-distance-top:0;mso-wrap-distance-right:9pt;mso-wrap-distance-bottom:0;mso-position-horizontal:absolute;mso-position-horizontal-relative:text;mso-position-vertical:absolute;mso-position-vertical-relative:text;mso-height-percent:0;mso-height-relative:margin;v-text-anchor:top" coordsize="855980,8852535" o:gfxdata="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" path="m855453,8851937l,8851937,,,855453,r,8851937xe" stroked="f">
               <v:path arrowok="t"/>
             </v:shape>
           </w:pict>
@@ -8060,7 +8110,8 @@
       <w:szCs w:val="48"/>
     </w:rPr>
   </w:style>
-  <w:style w:type="table" w:customStyle="1" w:styleId="a">
+  <w:style w:type="table" w:customStyle="1" w:styleId="8">
+    <w:name w:val="8"/>
     <w:basedOn w:val="TableNormal"/>
     <w:pPr>
       <w:spacing w:after="0" w:line="240" w:lineRule="auto"/>
@@ -8070,7 +8121,8 @@
       <w:tblStyleColBandSize w:val="1"/>
     </w:tblPr>
   </w:style>
-  <w:style w:type="table" w:customStyle="1" w:styleId="a0">
+  <w:style w:type="table" w:customStyle="1" w:styleId="7">
+    <w:name w:val="7"/>
     <w:basedOn w:val="TableNormal"/>
     <w:pPr>
       <w:spacing w:after="0" w:line="240" w:lineRule="auto"/>
@@ -8080,7 +8132,8 @@
       <w:tblStyleColBandSize w:val="1"/>
     </w:tblPr>
   </w:style>
-  <w:style w:type="table" w:customStyle="1" w:styleId="a1">
+  <w:style w:type="table" w:customStyle="1" w:styleId="6">
+    <w:name w:val="6"/>
     <w:basedOn w:val="TableNormal"/>
     <w:tblPr>
       <w:tblStyleRowBandSize w:val="1"/>
@@ -8093,7 +8146,8 @@
       </w:tblCellMar>
     </w:tblPr>
   </w:style>
-  <w:style w:type="table" w:customStyle="1" w:styleId="a2">
+  <w:style w:type="table" w:customStyle="1" w:styleId="5">
+    <w:name w:val="5"/>
     <w:basedOn w:val="TableNormal"/>
     <w:pPr>
       <w:spacing w:after="0" w:line="240" w:lineRule="auto"/>
@@ -8103,7 +8157,8 @@
       <w:tblStyleColBandSize w:val="1"/>
     </w:tblPr>
   </w:style>
-  <w:style w:type="table" w:customStyle="1" w:styleId="a3">
+  <w:style w:type="table" w:customStyle="1" w:styleId="4">
+    <w:name w:val="4"/>
     <w:basedOn w:val="TableNormal"/>
     <w:pPr>
       <w:spacing w:after="0" w:line="240" w:lineRule="auto"/>
@@ -8113,7 +8168,8 @@
       <w:tblStyleColBandSize w:val="1"/>
     </w:tblPr>
   </w:style>
-  <w:style w:type="table" w:customStyle="1" w:styleId="a4">
+  <w:style w:type="table" w:customStyle="1" w:styleId="3">
+    <w:name w:val="3"/>
     <w:basedOn w:val="TableNormal"/>
     <w:pPr>
       <w:spacing w:after="0" w:line="240" w:lineRule="auto"/>
@@ -8123,7 +8179,8 @@
       <w:tblStyleColBandSize w:val="1"/>
     </w:tblPr>
   </w:style>
-  <w:style w:type="table" w:customStyle="1" w:styleId="a5">
+  <w:style w:type="table" w:customStyle="1" w:styleId="2">
+    <w:name w:val="2"/>
     <w:basedOn w:val="TableNormal"/>
     <w:tblPr>
       <w:tblStyleRowBandSize w:val="1"/>
@@ -8136,7 +8193,8 @@
       </w:tblCellMar>
     </w:tblPr>
   </w:style>
-  <w:style w:type="table" w:customStyle="1" w:styleId="a6">
+  <w:style w:type="table" w:customStyle="1" w:styleId="1">
+    <w:name w:val="1"/>
     <w:basedOn w:val="TableNormal"/>
     <w:pPr>
       <w:spacing w:after="0" w:line="240" w:lineRule="auto"/>

</xml_diff>